<commit_message>
Fixed purpose of meeting not being generated. Create layout for different pages. Created attendees page with full CRUD capabilities. Created fuzzy matching algorithm to compare attendee names with database and replace them with defined ones. Add remember me button to quickly add new attendees to database. Completely changed design of All screens.
</commit_message>
<xml_diff>
--- a/test/mom template/DARAH Mom Template.docx
+++ b/test/mom template/DARAH Mom Template.docx
@@ -1793,6 +1793,16 @@
                 <w:szCs w:val="20"/>
               </w:rPr>
             </w:pPr>
+            <w:r>
+              <w:rPr>
+                <w:rFonts w:asciiTheme="majorBidi" w:hAnsiTheme="majorBidi" w:cstheme="majorBidi"/>
+                <w:b/>
+                <w:bCs/>
+                <w:sz w:val="20"/>
+                <w:szCs w:val="20"/>
+              </w:rPr>
+              <w:t>{{discussions}}</w:t>
+            </w:r>
           </w:p>
         </w:tc>
       </w:tr>
@@ -2155,27 +2165,7 @@
                 <w:szCs w:val="20"/>
                 <w:lang w:val="en-GB"/>
               </w:rPr>
-              <w:t xml:space="preserve">{%tr for item in </w:t>
-            </w:r>
-            <w:proofErr w:type="spellStart"/>
-            <w:r>
-              <w:rPr>
-                <w:rFonts w:asciiTheme="majorBidi" w:hAnsiTheme="majorBidi" w:cstheme="majorBidi"/>
-                <w:sz w:val="20"/>
-                <w:szCs w:val="20"/>
-                <w:lang w:val="en-GB"/>
-              </w:rPr>
-              <w:t>action_items</w:t>
-            </w:r>
-            <w:proofErr w:type="spellEnd"/>
-            <w:r>
-              <w:rPr>
-                <w:rFonts w:asciiTheme="majorBidi" w:hAnsiTheme="majorBidi" w:cstheme="majorBidi"/>
-                <w:sz w:val="20"/>
-                <w:szCs w:val="20"/>
-                <w:lang w:val="en-GB"/>
-              </w:rPr>
-              <w:t xml:space="preserve"> %}</w:t>
+              <w:t>{%tr for item in action_items %}</w:t>
             </w:r>
           </w:p>
         </w:tc>
@@ -2270,25 +2260,7 @@
                 <w:sz w:val="20"/>
                 <w:szCs w:val="20"/>
               </w:rPr>
-              <w:t xml:space="preserve">{{ </w:t>
-            </w:r>
-            <w:proofErr w:type="spellStart"/>
-            <w:r>
-              <w:rPr>
-                <w:rFonts w:asciiTheme="majorBidi" w:hAnsiTheme="majorBidi" w:cstheme="majorBidi"/>
-                <w:sz w:val="20"/>
-                <w:szCs w:val="20"/>
-              </w:rPr>
-              <w:t>item.deadline</w:t>
-            </w:r>
-            <w:proofErr w:type="spellEnd"/>
-            <w:r>
-              <w:rPr>
-                <w:rFonts w:asciiTheme="majorBidi" w:hAnsiTheme="majorBidi" w:cstheme="majorBidi"/>
-                <w:sz w:val="20"/>
-                <w:szCs w:val="20"/>
-              </w:rPr>
-              <w:t xml:space="preserve"> }}</w:t>
+              <w:t>{{ item.deadline }}</w:t>
             </w:r>
           </w:p>
         </w:tc>
@@ -2319,25 +2291,7 @@
                 <w:sz w:val="20"/>
                 <w:szCs w:val="20"/>
               </w:rPr>
-              <w:t xml:space="preserve">{{ </w:t>
-            </w:r>
-            <w:proofErr w:type="spellStart"/>
-            <w:r>
-              <w:rPr>
-                <w:rFonts w:asciiTheme="majorHAnsi" w:hAnsiTheme="majorHAnsi" w:cstheme="majorHAnsi"/>
-                <w:sz w:val="20"/>
-                <w:szCs w:val="20"/>
-              </w:rPr>
-              <w:t>item.owner</w:t>
-            </w:r>
-            <w:proofErr w:type="spellEnd"/>
-            <w:r>
-              <w:rPr>
-                <w:rFonts w:asciiTheme="majorHAnsi" w:hAnsiTheme="majorHAnsi" w:cstheme="majorHAnsi"/>
-                <w:sz w:val="20"/>
-                <w:szCs w:val="20"/>
-              </w:rPr>
-              <w:t xml:space="preserve"> }}</w:t>
+              <w:t>{{ item.owner }}</w:t>
             </w:r>
           </w:p>
         </w:tc>
@@ -2368,25 +2322,7 @@
                 <w:sz w:val="20"/>
                 <w:szCs w:val="20"/>
               </w:rPr>
-              <w:t xml:space="preserve">{{ </w:t>
-            </w:r>
-            <w:proofErr w:type="spellStart"/>
-            <w:r>
-              <w:rPr>
-                <w:rFonts w:asciiTheme="majorHAnsi" w:hAnsiTheme="majorHAnsi" w:cstheme="majorHAnsi"/>
-                <w:sz w:val="20"/>
-                <w:szCs w:val="20"/>
-              </w:rPr>
-              <w:t>item.task</w:t>
-            </w:r>
-            <w:proofErr w:type="spellEnd"/>
-            <w:r>
-              <w:rPr>
-                <w:rFonts w:asciiTheme="majorHAnsi" w:hAnsiTheme="majorHAnsi" w:cstheme="majorHAnsi"/>
-                <w:sz w:val="20"/>
-                <w:szCs w:val="20"/>
-              </w:rPr>
-              <w:t xml:space="preserve"> }}</w:t>
+              <w:t>{{ item.task }}</w:t>
             </w:r>
           </w:p>
         </w:tc>
@@ -2524,25 +2460,7 @@
                 <w:sz w:val="20"/>
                 <w:szCs w:val="20"/>
               </w:rPr>
-              <w:t xml:space="preserve">{%tr </w:t>
-            </w:r>
-            <w:proofErr w:type="spellStart"/>
-            <w:r>
-              <w:rPr>
-                <w:rFonts w:asciiTheme="majorBidi" w:hAnsiTheme="majorBidi" w:cstheme="majorBidi"/>
-                <w:sz w:val="20"/>
-                <w:szCs w:val="20"/>
-              </w:rPr>
-              <w:t>endfor</w:t>
-            </w:r>
-            <w:proofErr w:type="spellEnd"/>
-            <w:r>
-              <w:rPr>
-                <w:rFonts w:asciiTheme="majorBidi" w:hAnsiTheme="majorBidi" w:cstheme="majorBidi"/>
-                <w:sz w:val="20"/>
-                <w:szCs w:val="20"/>
-              </w:rPr>
-              <w:t xml:space="preserve"> %}</w:t>
+              <w:t>{%tr endfor %}</w:t>
             </w:r>
           </w:p>
         </w:tc>
@@ -2730,17 +2648,7 @@
                 <w:szCs w:val="20"/>
                 <w:rtl/>
               </w:rPr>
-              <w:t xml:space="preserve">  </w:t>
-            </w:r>
-            <w:r>
-              <w:rPr>
-                <w:rFonts w:asciiTheme="majorBidi" w:hAnsiTheme="majorBidi" w:cstheme="majorBidi"/>
-                <w:color w:val="A79F88"/>
-                <w:sz w:val="20"/>
-                <w:szCs w:val="20"/>
-                <w:rtl/>
-              </w:rPr>
-              <w:t>صفحة</w:t>
+              <w:t xml:space="preserve">  صفحة</w:t>
             </w:r>
             <w:r>
               <w:rPr>
@@ -5945,6 +5853,30 @@
 </file>
 
 <file path=customXml/item1.xml><?xml version="1.0" encoding="utf-8"?>
+<b:Sources xmlns:b="http://schemas.openxmlformats.org/officeDocument/2006/bibliography" xmlns="http://schemas.openxmlformats.org/officeDocument/2006/bibliography" SelectedStyle="\APASixthEditionOfficeOnline.xsl" StyleName="APA" Version="6"/>
+</file>
+
+<file path=customXml/item2.xml><?xml version="1.0" encoding="utf-8"?>
+<p:properties xmlns:p="http://schemas.microsoft.com/office/2006/metadata/properties" xmlns:xsi="http://www.w3.org/2001/XMLSchema-instance" xmlns:pc="http://schemas.microsoft.com/office/infopath/2007/PartnerControls">
+  <documentManagement>
+    <lcf76f155ced4ddcb4097134ff3c332f xmlns="7260ee0e-cdb6-4ab4-88d8-88d8fa0cdbf8">
+      <Terms xmlns="http://schemas.microsoft.com/office/infopath/2007/PartnerControls"/>
+    </lcf76f155ced4ddcb4097134ff3c332f>
+    <TaxCatchAll xmlns="59975272-0bad-400b-9cef-9cc26dcf7ffe" xsi:nil="true"/>
+  </documentManagement>
+</p:properties>
+</file>
+
+<file path=customXml/item3.xml><?xml version="1.0" encoding="utf-8"?>
+<?mso-contentType ?>
+<FormTemplates xmlns="http://schemas.microsoft.com/sharepoint/v3/contenttype/forms">
+  <Display>DocumentLibraryForm</Display>
+  <Edit>DocumentLibraryForm</Edit>
+  <New>DocumentLibraryForm</New>
+</FormTemplates>
+</file>
+
+<file path=customXml/item4.xml><?xml version="1.0" encoding="utf-8"?>
 <ct:contentTypeSchema xmlns:ct="http://schemas.microsoft.com/office/2006/metadata/contentType" xmlns:ma="http://schemas.microsoft.com/office/2006/metadata/properties/metaAttributes" ct:_="" ma:_="" ma:contentTypeName="Document" ma:contentTypeID="0x0101007E34F50072881F409839E7C4D09BBCA2" ma:contentTypeVersion="13" ma:contentTypeDescription="Create a new document." ma:contentTypeScope="" ma:versionID="ca84aa07066ed80fbe0016d9d5692e17">
   <xsd:schema xmlns:xsd="http://www.w3.org/2001/XMLSchema" xmlns:xs="http://www.w3.org/2001/XMLSchema" xmlns:p="http://schemas.microsoft.com/office/2006/metadata/properties" xmlns:ns2="7260ee0e-cdb6-4ab4-88d8-88d8fa0cdbf8" xmlns:ns3="59975272-0bad-400b-9cef-9cc26dcf7ffe" targetNamespace="http://schemas.microsoft.com/office/2006/metadata/properties" ma:root="true" ma:fieldsID="eb7ccfc88d72bb3807af459e65e9d13b" ns2:_="" ns3:_="">
     <xsd:import namespace="7260ee0e-cdb6-4ab4-88d8-88d8fa0cdbf8"/>
@@ -6151,31 +6083,34 @@
 </ct:contentTypeSchema>
 </file>
 
-<file path=customXml/item2.xml><?xml version="1.0" encoding="utf-8"?>
-<?mso-contentType ?>
-<FormTemplates xmlns="http://schemas.microsoft.com/sharepoint/v3/contenttype/forms">
-  <Display>DocumentLibraryForm</Display>
-  <Edit>DocumentLibraryForm</Edit>
-  <New>DocumentLibraryForm</New>
-</FormTemplates>
+<file path=customXml/itemProps1.xml><?xml version="1.0" encoding="utf-8"?>
+<ds:datastoreItem xmlns:ds="http://schemas.openxmlformats.org/officeDocument/2006/customXml" ds:itemID="{8AA13928-7109-4E06-9E2E-C03F885D1F3A}">
+  <ds:schemaRefs>
+    <ds:schemaRef ds:uri="http://schemas.openxmlformats.org/officeDocument/2006/bibliography"/>
+  </ds:schemaRefs>
+</ds:datastoreItem>
 </file>
 
-<file path=customXml/item3.xml><?xml version="1.0" encoding="utf-8"?>
-<p:properties xmlns:p="http://schemas.microsoft.com/office/2006/metadata/properties" xmlns:xsi="http://www.w3.org/2001/XMLSchema-instance" xmlns:pc="http://schemas.microsoft.com/office/infopath/2007/PartnerControls">
-  <documentManagement>
-    <lcf76f155ced4ddcb4097134ff3c332f xmlns="7260ee0e-cdb6-4ab4-88d8-88d8fa0cdbf8">
-      <Terms xmlns="http://schemas.microsoft.com/office/infopath/2007/PartnerControls"/>
-    </lcf76f155ced4ddcb4097134ff3c332f>
-    <TaxCatchAll xmlns="59975272-0bad-400b-9cef-9cc26dcf7ffe" xsi:nil="true"/>
-  </documentManagement>
-</p:properties>
+<file path=customXml/itemProps2.xml><?xml version="1.0" encoding="utf-8"?>
+<ds:datastoreItem xmlns:ds="http://schemas.openxmlformats.org/officeDocument/2006/customXml" ds:itemID="{A9E457AB-279D-4C70-81A5-79B1E219B9C6}">
+  <ds:schemaRefs>
+    <ds:schemaRef ds:uri="http://schemas.microsoft.com/office/2006/metadata/properties"/>
+    <ds:schemaRef ds:uri="http://schemas.microsoft.com/office/infopath/2007/PartnerControls"/>
+    <ds:schemaRef ds:uri="7260ee0e-cdb6-4ab4-88d8-88d8fa0cdbf8"/>
+    <ds:schemaRef ds:uri="59975272-0bad-400b-9cef-9cc26dcf7ffe"/>
+  </ds:schemaRefs>
+</ds:datastoreItem>
 </file>
 
-<file path=customXml/item4.xml><?xml version="1.0" encoding="utf-8"?>
-<b:Sources xmlns:b="http://schemas.openxmlformats.org/officeDocument/2006/bibliography" xmlns="http://schemas.openxmlformats.org/officeDocument/2006/bibliography" SelectedStyle="\APASixthEditionOfficeOnline.xsl" StyleName="APA" Version="6"/>
+<file path=customXml/itemProps3.xml><?xml version="1.0" encoding="utf-8"?>
+<ds:datastoreItem xmlns:ds="http://schemas.openxmlformats.org/officeDocument/2006/customXml" ds:itemID="{FEA58E5F-2EB4-4879-AC15-A30D67E1E9FF}">
+  <ds:schemaRefs>
+    <ds:schemaRef ds:uri="http://schemas.microsoft.com/sharepoint/v3/contenttype/forms"/>
+  </ds:schemaRefs>
+</ds:datastoreItem>
 </file>
 
-<file path=customXml/itemProps1.xml><?xml version="1.0" encoding="utf-8"?>
+<file path=customXml/itemProps4.xml><?xml version="1.0" encoding="utf-8"?>
 <ds:datastoreItem xmlns:ds="http://schemas.openxmlformats.org/officeDocument/2006/customXml" ds:itemID="{F20EC7E6-828D-4A66-AD6E-99590BABCB83}">
   <ds:schemaRefs>
     <ds:schemaRef ds:uri="http://schemas.microsoft.com/office/2006/metadata/contentType"/>
@@ -6194,33 +6129,6 @@
 </ds:datastoreItem>
 </file>
 
-<file path=customXml/itemProps2.xml><?xml version="1.0" encoding="utf-8"?>
-<ds:datastoreItem xmlns:ds="http://schemas.openxmlformats.org/officeDocument/2006/customXml" ds:itemID="{FEA58E5F-2EB4-4879-AC15-A30D67E1E9FF}">
-  <ds:schemaRefs>
-    <ds:schemaRef ds:uri="http://schemas.microsoft.com/sharepoint/v3/contenttype/forms"/>
-  </ds:schemaRefs>
-</ds:datastoreItem>
-</file>
-
-<file path=customXml/itemProps3.xml><?xml version="1.0" encoding="utf-8"?>
-<ds:datastoreItem xmlns:ds="http://schemas.openxmlformats.org/officeDocument/2006/customXml" ds:itemID="{A9E457AB-279D-4C70-81A5-79B1E219B9C6}">
-  <ds:schemaRefs>
-    <ds:schemaRef ds:uri="http://schemas.microsoft.com/office/2006/metadata/properties"/>
-    <ds:schemaRef ds:uri="http://schemas.microsoft.com/office/infopath/2007/PartnerControls"/>
-    <ds:schemaRef ds:uri="7260ee0e-cdb6-4ab4-88d8-88d8fa0cdbf8"/>
-    <ds:schemaRef ds:uri="59975272-0bad-400b-9cef-9cc26dcf7ffe"/>
-  </ds:schemaRefs>
-</ds:datastoreItem>
-</file>
-
-<file path=customXml/itemProps4.xml><?xml version="1.0" encoding="utf-8"?>
-<ds:datastoreItem xmlns:ds="http://schemas.openxmlformats.org/officeDocument/2006/customXml" ds:itemID="{8AA13928-7109-4E06-9E2E-C03F885D1F3A}">
-  <ds:schemaRefs>
-    <ds:schemaRef ds:uri="http://schemas.openxmlformats.org/officeDocument/2006/bibliography"/>
-  </ds:schemaRefs>
-</ds:datastoreItem>
-</file>
-
 <file path=docMetadata/LabelInfo.xml><?xml version="1.0" encoding="utf-8"?>
 <clbl:labelList xmlns:clbl="http://schemas.microsoft.com/office/2020/mipLabelMetadata">
   <clbl:label id="{deff24bb-2089-4400-8c8e-f71e680378b2}" enabled="0" method="" siteId="{deff24bb-2089-4400-8c8e-f71e680378b2}" removed="1"/>

</xml_diff>